<commit_message>
Redesign the technical presentation and the architecture document
Technical presentation (5 slides), now in the same clean style as the idea deck:
- Overview with the dashboard and four headline results
- Architecture diagram with the flow, packet and ingestion details
- World model explained next to real dashboard output: the 60 s forecast,
  Integrated Gradients and host attribution at a DDoS onset
- Results chart (forecast, early warning, detection vs the baseline) with
  where we lead, where the baseline leads, and the open problem
- Demo, deployment, limits, next steps, reproduction, QR codes for the video
  and the repository

Architecture document (2 pages): title block with the logo, key-figures strip,
components table, restyled results table with plain findings, the prototype
screenshot instead of the dense timeline plot, links and page numbers.
Document properties name the team.
</commit_message>
<xml_diff>
--- a/docs/VIGHNAX_Architecture.docx
+++ b/docs/VIGHNAX_Architecture.docx
@@ -2,32 +2,286 @@
 <file path=word/document.xml><?xml version="1.0" encoding="utf-8"?>
 <w:document xmlns:wpc="http://schemas.microsoft.com/office/word/2010/wordprocessingCanvas" xmlns:mo="http://schemas.microsoft.com/office/mac/office/2008/main" xmlns:mc="http://schemas.openxmlformats.org/markup-compatibility/2006" xmlns:mv="urn:schemas-microsoft-com:mac:vml" xmlns:o="urn:schemas-microsoft-com:office:office" xmlns:r="http://schemas.openxmlformats.org/officeDocument/2006/relationships" xmlns:m="http://schemas.openxmlformats.org/officeDocument/2006/math" xmlns:v="urn:schemas-microsoft-com:vml" xmlns:wp14="http://schemas.microsoft.com/office/word/2010/wordprocessingDrawing" xmlns:wp="http://schemas.openxmlformats.org/drawingml/2006/wordprocessingDrawing" xmlns:w10="urn:schemas-microsoft-com:office:word" xmlns:w="http://schemas.openxmlformats.org/wordprocessingml/2006/main" xmlns:w14="http://schemas.microsoft.com/office/word/2010/wordml" xmlns:wpg="http://schemas.microsoft.com/office/word/2010/wordprocessingGroup" xmlns:wpi="http://schemas.microsoft.com/office/word/2010/wordprocessingInk" xmlns:wne="http://schemas.microsoft.com/office/word/2006/wordml" xmlns:wps="http://schemas.microsoft.com/office/word/2010/wordprocessingShape" mc:Ignorable="w14 wp14">
   <w:body>
+    <w:tbl>
+      <w:tblPr>
+        <w:tblW w:type="auto" w:w="0"/>
+        <w:tblLook w:firstColumn="1" w:firstRow="1" w:lastColumn="0" w:lastRow="0" w:noHBand="0" w:noVBand="1" w:val="04A0"/>
+        <w:tblBorders>
+          <w:top w:val="nil"/>
+          <w:left w:val="nil"/>
+          <w:bottom w:val="nil"/>
+          <w:right w:val="nil"/>
+          <w:insideH w:val="nil"/>
+          <w:insideV w:val="nil"/>
+        </w:tblBorders>
+      </w:tblPr>
+      <w:tblGrid>
+        <w:gridCol w:w="1077"/>
+        <w:gridCol w:w="9014"/>
+      </w:tblGrid>
+      <w:tr>
+        <w:tc>
+          <w:tcPr>
+            <w:tcW w:type="dxa" w:w="1077"/>
+            <w:vAlign w:val="center"/>
+          </w:tcPr>
+          <w:p>
+            <w:r>
+              <w:drawing>
+                <wp:inline xmlns:a="http://schemas.openxmlformats.org/drawingml/2006/main" xmlns:pic="http://schemas.openxmlformats.org/drawingml/2006/picture">
+                  <wp:extent cx="561094" cy="630000"/>
+                  <wp:docPr id="1" name="Picture 1"/>
+                  <wp:cNvGraphicFramePr>
+                    <a:graphicFrameLocks noChangeAspect="1"/>
+                  </wp:cNvGraphicFramePr>
+                  <a:graphic>
+                    <a:graphicData uri="http://schemas.openxmlformats.org/drawingml/2006/picture">
+                      <pic:pic>
+                        <pic:nvPicPr>
+                          <pic:cNvPr id="0" name="logo_brown.png"/>
+                          <pic:cNvPicPr/>
+                        </pic:nvPicPr>
+                        <pic:blipFill>
+                          <a:blip r:embed="rId10"/>
+                          <a:stretch>
+                            <a:fillRect/>
+                          </a:stretch>
+                        </pic:blipFill>
+                        <pic:spPr>
+                          <a:xfrm>
+                            <a:off x="0" y="0"/>
+                            <a:ext cx="561094" cy="630000"/>
+                          </a:xfrm>
+                          <a:prstGeom prst="rect"/>
+                        </pic:spPr>
+                      </pic:pic>
+                    </a:graphicData>
+                  </a:graphic>
+                </wp:inline>
+              </w:drawing>
+            </w:r>
+          </w:p>
+        </w:tc>
+        <w:tc>
+          <w:tcPr>
+            <w:tcW w:type="dxa" w:w="9014"/>
+            <w:vAlign w:val="center"/>
+          </w:tcPr>
+          <w:p>
+            <w:pPr>
+              <w:spacing w:after="0"/>
+              <w:jc w:val="left"/>
+            </w:pPr>
+            <w:r>
+              <w:rPr>
+                <w:b/>
+                <w:color w:val="1F2933"/>
+                <w:sz w:val="32"/>
+              </w:rPr>
+              <w:t>VIGHNAX (BhaviṣyAdvaktā)</w:t>
+            </w:r>
+          </w:p>
+          <w:p>
+            <w:pPr>
+              <w:spacing w:after="0"/>
+              <w:jc w:val="left"/>
+            </w:pPr>
+            <w:r>
+              <w:rPr>
+                <w:b w:val="0"/>
+                <w:color w:val="1F4E9A"/>
+                <w:sz w:val="24"/>
+              </w:rPr>
+              <w:t>World-model forecasting of network attack progression</w:t>
+            </w:r>
+          </w:p>
+          <w:p>
+            <w:pPr>
+              <w:spacing w:after="0"/>
+              <w:jc w:val="left"/>
+            </w:pPr>
+            <w:r>
+              <w:rPr>
+                <w:b w:val="0"/>
+                <w:color w:val="52606D"/>
+                <w:sz w:val="17"/>
+              </w:rPr>
+              <w:t>Architecture document · SIH 2026 · PS SIH26153 (NTRO): AI-based Network Attack Forecasting from Network Traffic Data · Team VIGHNAX (Team ID 127364) · open source (MIT), fully offline</w:t>
+            </w:r>
+          </w:p>
+        </w:tc>
+      </w:tr>
+    </w:tbl>
     <w:p>
       <w:pPr>
         <w:spacing w:after="0"/>
       </w:pPr>
       <w:r>
         <w:rPr>
-          <w:b/>
-          <w:color w:val="1F2933"/>
-          <w:sz w:val="28"/>
+          <w:b w:val="0"/>
+          <w:sz w:val="8"/>
         </w:rPr>
-        <w:t>VIGHNAX — BhaviṣyAdvaktā: World-Model Forecasting of Network Attack Progression</w:t>
       </w:r>
     </w:p>
-    <w:p>
-      <w:pPr>
-        <w:spacing w:after="80"/>
-      </w:pPr>
-      <w:r>
-        <w:rPr>
-          <w:b w:val="0"/>
-          <w:color w:val="52606D"/>
-          <w:sz w:val="17"/>
-        </w:rPr>
-        <w:t>Architecture document · SIH 2026 · PS SIH26153 (NTRO) · AI-based Network Attack Forecasting from Network Traffic Data · Team VIGHNAX (Team ID 127364) · open source (MIT), fully offline</w:t>
-      </w:r>
-    </w:p>
+    <w:tbl>
+      <w:tblPr>
+        <w:tblW w:type="auto" w:w="0"/>
+        <w:jc w:val="center"/>
+        <w:tblLook w:firstColumn="1" w:firstRow="1" w:lastColumn="0" w:lastRow="0" w:noHBand="0" w:noVBand="1" w:val="04A0"/>
+        <w:tblBorders>
+          <w:top w:val="single" w:sz="24" w:space="0" w:color="FFFFFF"/>
+          <w:left w:val="single" w:sz="24" w:space="0" w:color="FFFFFF"/>
+          <w:bottom w:val="single" w:sz="24" w:space="0" w:color="FFFFFF"/>
+          <w:right w:val="single" w:sz="24" w:space="0" w:color="FFFFFF"/>
+          <w:insideH w:val="single" w:sz="24" w:space="0" w:color="FFFFFF"/>
+          <w:insideV w:val="single" w:sz="24" w:space="0" w:color="FFFFFF"/>
+        </w:tblBorders>
+      </w:tblPr>
+      <w:tblGrid>
+        <w:gridCol w:w="2523"/>
+        <w:gridCol w:w="2523"/>
+        <w:gridCol w:w="2523"/>
+        <w:gridCol w:w="2523"/>
+      </w:tblGrid>
+      <w:tr>
+        <w:tc>
+          <w:tcPr>
+            <w:tcW w:type="dxa" w:w="2523"/>
+            <w:shd w:val="clear" w:color="auto" w:fill="EEF3FA"/>
+          </w:tcPr>
+          <w:p>
+            <w:pPr>
+              <w:spacing w:after="0" w:before="80"/>
+              <w:jc w:val="center"/>
+            </w:pPr>
+            <w:r>
+              <w:rPr>
+                <w:b/>
+                <w:color w:val="1F4E9A"/>
+                <w:sz w:val="30"/>
+              </w:rPr>
+              <w:t>54 / 201</w:t>
+            </w:r>
+          </w:p>
+          <w:p>
+            <w:pPr>
+              <w:spacing w:after="80"/>
+              <w:jc w:val="center"/>
+            </w:pPr>
+            <w:r>
+              <w:rPr>
+                <w:b w:val="0"/>
+                <w:color w:val="52606D"/>
+                <w:sz w:val="16"/>
+              </w:rPr>
+              <w:t>attack onsets forecast before they began (baseline: 17)</w:t>
+            </w:r>
+          </w:p>
+        </w:tc>
+        <w:tc>
+          <w:tcPr>
+            <w:tcW w:type="dxa" w:w="2523"/>
+            <w:shd w:val="clear" w:color="auto" w:fill="EEF3FA"/>
+          </w:tcPr>
+          <w:p>
+            <w:pPr>
+              <w:spacing w:after="0" w:before="80"/>
+              <w:jc w:val="center"/>
+            </w:pPr>
+            <w:r>
+              <w:rPr>
+                <w:b/>
+                <w:color w:val="1F4E9A"/>
+                <w:sz w:val="30"/>
+              </w:rPr>
+              <w:t>0.70 vs 0.67</w:t>
+            </w:r>
+          </w:p>
+          <w:p>
+            <w:pPr>
+              <w:spacing w:after="80"/>
+              <w:jc w:val="center"/>
+            </w:pPr>
+            <w:r>
+              <w:rPr>
+                <w:b w:val="0"/>
+                <w:color w:val="52606D"/>
+                <w:sz w:val="16"/>
+              </w:rPr>
+              <w:t>macro forecast AUROC on unseen test data, vs the baseline</w:t>
+            </w:r>
+          </w:p>
+        </w:tc>
+        <w:tc>
+          <w:tcPr>
+            <w:tcW w:type="dxa" w:w="2523"/>
+            <w:shd w:val="clear" w:color="auto" w:fill="EEF3FA"/>
+          </w:tcPr>
+          <w:p>
+            <w:pPr>
+              <w:spacing w:after="0" w:before="80"/>
+              <w:jc w:val="center"/>
+            </w:pPr>
+            <w:r>
+              <w:rPr>
+                <w:b/>
+                <w:color w:val="1F4E9A"/>
+                <w:sz w:val="30"/>
+              </w:rPr>
+              <w:t>7 of 7</w:t>
+            </w:r>
+          </w:p>
+          <w:p>
+            <w:pPr>
+              <w:spacing w:after="80"/>
+              <w:jc w:val="center"/>
+            </w:pPr>
+            <w:r>
+              <w:rPr>
+                <w:b w:val="0"/>
+                <w:color w:val="52606D"/>
+                <w:sz w:val="16"/>
+              </w:rPr>
+              <w:t>PS datasets in one model, tested on unseen traffic</w:t>
+            </w:r>
+          </w:p>
+        </w:tc>
+        <w:tc>
+          <w:tcPr>
+            <w:tcW w:type="dxa" w:w="2523"/>
+            <w:shd w:val="clear" w:color="auto" w:fill="EEF3FA"/>
+          </w:tcPr>
+          <w:p>
+            <w:pPr>
+              <w:spacing w:after="0" w:before="80"/>
+              <w:jc w:val="center"/>
+            </w:pPr>
+            <w:r>
+              <w:rPr>
+                <w:b/>
+                <w:color w:val="1F4E9A"/>
+                <w:sz w:val="30"/>
+              </w:rPr>
+              <w:t>~8 ms</w:t>
+            </w:r>
+          </w:p>
+          <w:p>
+            <w:pPr>
+              <w:spacing w:after="80"/>
+              <w:jc w:val="center"/>
+            </w:pPr>
+            <w:r>
+              <w:rPr>
+                <w:b w:val="0"/>
+                <w:color w:val="52606D"/>
+                <w:sz w:val="16"/>
+              </w:rPr>
+              <w:t>per 10 s window on a laptop CPU, fully offline</w:t>
+            </w:r>
+          </w:p>
+        </w:tc>
+      </w:tr>
+    </w:tbl>
     <w:p>
       <w:pPr>
         <w:pStyle w:val="Heading1"/>
@@ -53,7 +307,7 @@
         <w:rPr>
           <w:b w:val="0"/>
         </w:rPr>
-        <w:t xml:space="preserve"> — the transition distribution P(St+1 | S≤t) — from flow-level and packet-level telemetry, then rolls that model forward K steps to estimate whether the current trajectory leads to compromise, which MITRE ATT&amp;CK stage comes next, and which traffic features drive the prediction. One model is trained on all seven datasets named in the PS.</w:t>
+        <w:t xml:space="preserve"> (the transition distribution P(S_t+1 | S_≤t)) from flow-level and packet-level telemetry. Rolling that model forward 60 s shows whether the current trajectory leads to compromise, which MITRE ATT&amp;CK stage comes next, which traffic features drive the prediction and which hosts are responsible. One model is trained on all seven datasets named in the PS.</w:t>
       </w:r>
     </w:p>
     <w:p>
@@ -71,8 +325,8 @@
       <w:r>
         <w:drawing>
           <wp:inline xmlns:a="http://schemas.openxmlformats.org/drawingml/2006/main" xmlns:pic="http://schemas.openxmlformats.org/drawingml/2006/picture">
-            <wp:extent cx="6336000" cy="2361599"/>
-            <wp:docPr id="1" name="Picture 1"/>
+            <wp:extent cx="6263999" cy="2334763"/>
+            <wp:docPr id="2" name="Picture 2"/>
             <wp:cNvGraphicFramePr>
               <a:graphicFrameLocks noChangeAspect="1"/>
             </wp:cNvGraphicFramePr>
@@ -84,7 +338,7 @@
                     <pic:cNvPicPr/>
                   </pic:nvPicPr>
                   <pic:blipFill>
-                    <a:blip r:embed="rId9"/>
+                    <a:blip r:embed="rId11"/>
                     <a:stretch>
                       <a:fillRect/>
                     </a:stretch>
@@ -92,7 +346,7 @@
                   <pic:spPr>
                     <a:xfrm>
                       <a:off x="0" y="0"/>
-                      <a:ext cx="6336000" cy="2361599"/>
+                      <a:ext cx="6263999" cy="2334763"/>
                     </a:xfrm>
                     <a:prstGeom prst="rect"/>
                   </pic:spPr>
@@ -111,106 +365,230 @@
         <w:t>3. Components</w:t>
       </w:r>
     </w:p>
-    <w:p>
-      <w:pPr>
-        <w:pStyle w:val="ListBullet"/>
-        <w:spacing w:after="20"/>
-        <w:ind w:left="283"/>
-      </w:pPr>
-      <w:r>
-        <w:rPr>
-          <w:b/>
-        </w:rPr>
-        <w:t xml:space="preserve">Ingestion. </w:t>
-      </w:r>
-      <w:r>
-        <w:rPr>
-          <w:b w:val="0"/>
-        </w:rPr>
-        <w:t>A universal loader reads every PS dataset's native format by content: CTU-13 Argus binetflow, CIC-IDS2017/2018 CICFlowMeter CSV, UNSW-NB15 records, LANL flows; packet captures (pcap/pcapng, .gz/.bz2) are streamed at ~125k packets/s with headers decoded directly (a Scapy reference parser is included).</w:t>
-      </w:r>
-    </w:p>
-    <w:p>
-      <w:pPr>
-        <w:pStyle w:val="ListBullet"/>
-        <w:spacing w:after="20"/>
-        <w:ind w:left="283"/>
-      </w:pPr>
-      <w:r>
-        <w:rPr>
-          <w:b/>
-        </w:rPr>
-        <w:t xml:space="preserve">Network state S_t. </w:t>
-      </w:r>
-      <w:r>
-        <w:rPr>
-          <w:b w:val="0"/>
-        </w:rPr>
-        <w:t>Every 10 s window becomes a 78-dim vector: 47 flow-level features (5-tuple statistics, flags, bytes, packets, duration, IAT, fwd/bwd ratios, per-host maxima so one compromised host is not diluted) + 30 packet-level features (TTL mean and per-session variance, TCP window, IP fragment/DF flags, payload-size distribution, SYN-only/RST/ICMP shares, retransmissions, sequential-vs-randomised port-scan signatures) + a packet-present mask.</w:t>
-      </w:r>
-    </w:p>
-    <w:p>
-      <w:pPr>
-        <w:pStyle w:val="ListBullet"/>
-        <w:spacing w:after="20"/>
-        <w:ind w:left="283"/>
-      </w:pPr>
-      <w:r>
-        <w:rPr>
-          <w:b/>
-        </w:rPr>
-        <w:t xml:space="preserve">World model. </w:t>
-      </w:r>
-      <w:r>
-        <w:rPr>
-          <w:b w:val="0"/>
-        </w:rPr>
-        <w:t>Encoder q(z_t|S_t) → Gaussian latent; GRU memory h_t; prior p(z_t+1|h_t+1) = learned transition distribution; decoder p(S|z). Heads on (h, z) give P(infiltration) and a 7-way ATT&amp;CK stage distribution. Loss = reconstruction + KL(posterior‖prior) + attack/stage losses on observed states and on imagined K-step rollouts against the true future labels (supervised dynamics learning from each dataset's attack timeline). Modality dropout (CSV-only inputs), volume augmentation (network size) and dataset-balanced sampling (each epoch draws equally from all seven datasets).</w:t>
-      </w:r>
-    </w:p>
-    <w:p>
-      <w:pPr>
-        <w:pStyle w:val="ListBullet"/>
-        <w:spacing w:after="20"/>
-        <w:ind w:left="283"/>
-      </w:pPr>
-      <w:r>
-        <w:rPr>
-          <w:b/>
-        </w:rPr>
-        <w:t xml:space="preserve">Forward simulation and explanations. </w:t>
-      </w:r>
-      <w:r>
-        <w:rPr>
-          <w:b w:val="0"/>
-        </w:rPr>
-        <w:t>32 Monte-Carlo latent trajectories rolled K = 6 windows (60 s) ahead: per-window P(infiltration) with a 10–90 % band and the predicted stage mix with technique IDs. Integrated Gradients (Aumann–Shapley / SHAP family) attributes each forecast to flow- and packet-level features; leave-one-host-out occlusion flags the responsible hosts and flows.</w:t>
-      </w:r>
-    </w:p>
-    <w:p>
-      <w:pPr>
-        <w:pStyle w:val="ListBullet"/>
-        <w:spacing w:after="20"/>
-        <w:ind w:left="283"/>
-      </w:pPr>
-      <w:r>
-        <w:rPr>
-          <w:b/>
-        </w:rPr>
-        <w:t xml:space="preserve">Interface. </w:t>
-      </w:r>
-      <w:r>
-        <w:rPr>
-          <w:b w:val="0"/>
-        </w:rPr>
-        <w:t>Offline Flask dashboard (bundled Chart.js and fonts). One drop zone for any mix of flow files, PCAPs or a .zip; the world model streams its forecast window by window; the timeline, forecast fan, attributions and flagged hosts update live at a selectable playback speed (1× = real time). Alert thresholds are calibrated per network (site profile).</w:t>
-      </w:r>
-    </w:p>
-    <w:p>
-      <w:r>
-        <w:br w:type="page"/>
-      </w:r>
-    </w:p>
+    <w:tbl>
+      <w:tblPr>
+        <w:tblW w:type="auto" w:w="0"/>
+        <w:jc w:val="center"/>
+        <w:tblLook w:firstColumn="1" w:firstRow="1" w:lastColumn="0" w:lastRow="0" w:noHBand="0" w:noVBand="1" w:val="04A0"/>
+        <w:tblBorders>
+          <w:top w:val="single" w:sz="4" w:space="0" w:color="D5DDEA"/>
+          <w:left w:val="single" w:sz="4" w:space="0" w:color="D5DDEA"/>
+          <w:bottom w:val="single" w:sz="4" w:space="0" w:color="D5DDEA"/>
+          <w:right w:val="single" w:sz="4" w:space="0" w:color="D5DDEA"/>
+          <w:insideH w:val="single" w:sz="4" w:space="0" w:color="D5DDEA"/>
+          <w:insideV w:val="single" w:sz="4" w:space="0" w:color="D5DDEA"/>
+        </w:tblBorders>
+      </w:tblPr>
+      <w:tblGrid>
+        <w:gridCol w:w="5046"/>
+        <w:gridCol w:w="5046"/>
+      </w:tblGrid>
+      <w:tr>
+        <w:tc>
+          <w:tcPr>
+            <w:tcW w:type="dxa" w:w="1928"/>
+            <w:vAlign w:val="center"/>
+            <w:shd w:val="clear" w:color="auto" w:fill="EEF3FA"/>
+          </w:tcPr>
+          <w:p>
+            <w:pPr>
+              <w:spacing w:after="0"/>
+              <w:jc w:val="left"/>
+            </w:pPr>
+            <w:r>
+              <w:rPr>
+                <w:b/>
+                <w:color w:val="1F4E9A"/>
+                <w:sz w:val="18"/>
+              </w:rPr>
+              <w:t>Ingestion</w:t>
+            </w:r>
+          </w:p>
+        </w:tc>
+        <w:tc>
+          <w:tcPr>
+            <w:tcW w:type="dxa" w:w="8164"/>
+          </w:tcPr>
+          <w:p>
+            <w:pPr>
+              <w:spacing w:after="0"/>
+              <w:jc w:val="left"/>
+            </w:pPr>
+            <w:r>
+              <w:rPr>
+                <w:b w:val="0"/>
+                <w:sz w:val="18"/>
+              </w:rPr>
+              <w:t>Reads every PS dataset's native format, detected by content: CTU-13 Argus binetflow, CICFlowMeter CSV (CIC-IDS2017/2018), UNSW-NB15 records, LANL flows. Packet captures (pcap / pcapng, .gz / .bz2) are streamed at ~125k packets/s with headers decoded directly; a Scapy reference parser is included.</w:t>
+            </w:r>
+          </w:p>
+        </w:tc>
+      </w:tr>
+      <w:tr>
+        <w:tc>
+          <w:tcPr>
+            <w:tcW w:type="dxa" w:w="1928"/>
+            <w:vAlign w:val="center"/>
+            <w:shd w:val="clear" w:color="auto" w:fill="EEF3FA"/>
+          </w:tcPr>
+          <w:p>
+            <w:pPr>
+              <w:spacing w:after="0"/>
+              <w:jc w:val="left"/>
+            </w:pPr>
+            <w:r>
+              <w:rPr>
+                <w:b/>
+                <w:color w:val="1F4E9A"/>
+                <w:sz w:val="18"/>
+              </w:rPr>
+              <w:t>Network state S_t</w:t>
+            </w:r>
+          </w:p>
+        </w:tc>
+        <w:tc>
+          <w:tcPr>
+            <w:tcW w:type="dxa" w:w="8164"/>
+          </w:tcPr>
+          <w:p>
+            <w:pPr>
+              <w:spacing w:after="0"/>
+              <w:jc w:val="left"/>
+            </w:pPr>
+            <w:r>
+              <w:rPr>
+                <w:b w:val="0"/>
+                <w:sz w:val="18"/>
+              </w:rPr>
+              <w:t>Every 10 s window becomes a 78-dim vector: 47 flow-level features (5-tuple statistics, flags, bytes, packets, duration, IAT, fwd/bwd ratios, per-host maxima so one compromised host is not diluted), 30 packet-level features (TTL mean and per-session variance, TCP window, fragment / DF flags, payload-size distribution, SYN-only / RST / ICMP shares, retransmissions, port-scan signatures) and a packet-present mask.</w:t>
+            </w:r>
+          </w:p>
+        </w:tc>
+      </w:tr>
+      <w:tr>
+        <w:tc>
+          <w:tcPr>
+            <w:tcW w:type="dxa" w:w="1928"/>
+            <w:vAlign w:val="center"/>
+            <w:shd w:val="clear" w:color="auto" w:fill="EEF3FA"/>
+          </w:tcPr>
+          <w:p>
+            <w:pPr>
+              <w:spacing w:after="0"/>
+              <w:jc w:val="left"/>
+            </w:pPr>
+            <w:r>
+              <w:rPr>
+                <w:b/>
+                <w:color w:val="1F4E9A"/>
+                <w:sz w:val="18"/>
+              </w:rPr>
+              <w:t>World model</w:t>
+            </w:r>
+          </w:p>
+        </w:tc>
+        <w:tc>
+          <w:tcPr>
+            <w:tcW w:type="dxa" w:w="8164"/>
+          </w:tcPr>
+          <w:p>
+            <w:pPr>
+              <w:spacing w:after="0"/>
+              <w:jc w:val="left"/>
+            </w:pPr>
+            <w:r>
+              <w:rPr>
+                <w:b w:val="0"/>
+                <w:sz w:val="18"/>
+              </w:rPr>
+              <w:t>Encoder q(z_t | S_t) to a Gaussian latent; GRU memory h_t; learned transition prior p(z_t+1 | h_t+1); decoder p(S | z). Heads on (h, z) give P(infiltration) and a 7-way ATT&amp;CK stage distribution. Loss = reconstruction + KL(posterior ‖ prior) + attack and stage losses on observed states and on imagined K-step rollouts against the true future labels. Dataset-balanced sampling, modality dropout (CSV-only input) and volume augmentation.</w:t>
+            </w:r>
+          </w:p>
+        </w:tc>
+      </w:tr>
+      <w:tr>
+        <w:tc>
+          <w:tcPr>
+            <w:tcW w:type="dxa" w:w="1928"/>
+            <w:vAlign w:val="center"/>
+            <w:shd w:val="clear" w:color="auto" w:fill="EEF3FA"/>
+          </w:tcPr>
+          <w:p>
+            <w:pPr>
+              <w:spacing w:after="0"/>
+              <w:jc w:val="left"/>
+            </w:pPr>
+            <w:r>
+              <w:rPr>
+                <w:b/>
+                <w:color w:val="1F4E9A"/>
+                <w:sz w:val="18"/>
+              </w:rPr>
+              <w:t>Forecast and explanation</w:t>
+            </w:r>
+          </w:p>
+        </w:tc>
+        <w:tc>
+          <w:tcPr>
+            <w:tcW w:type="dxa" w:w="8164"/>
+          </w:tcPr>
+          <w:p>
+            <w:pPr>
+              <w:spacing w:after="0"/>
+              <w:jc w:val="left"/>
+            </w:pPr>
+            <w:r>
+              <w:rPr>
+                <w:b w:val="0"/>
+                <w:sz w:val="18"/>
+              </w:rPr>
+              <w:t>32 Monte-Carlo latent trajectories rolled K = 6 windows (60 s) ahead: P(infiltration) per window with a 10–90 % band and the predicted stage mix with technique IDs. Integrated Gradients attributes each forecast to flow and packet features against a benign reference state; removing each host in turn and re-forecasting ranks the responsible hosts and flows.</w:t>
+            </w:r>
+          </w:p>
+        </w:tc>
+      </w:tr>
+      <w:tr>
+        <w:tc>
+          <w:tcPr>
+            <w:tcW w:type="dxa" w:w="1928"/>
+            <w:vAlign w:val="center"/>
+            <w:shd w:val="clear" w:color="auto" w:fill="EEF3FA"/>
+          </w:tcPr>
+          <w:p>
+            <w:pPr>
+              <w:spacing w:after="0"/>
+              <w:jc w:val="left"/>
+            </w:pPr>
+            <w:r>
+              <w:rPr>
+                <w:b/>
+                <w:color w:val="1F4E9A"/>
+                <w:sz w:val="18"/>
+              </w:rPr>
+              <w:t>Interface</w:t>
+            </w:r>
+          </w:p>
+        </w:tc>
+        <w:tc>
+          <w:tcPr>
+            <w:tcW w:type="dxa" w:w="8164"/>
+          </w:tcPr>
+          <w:p>
+            <w:pPr>
+              <w:spacing w:after="0"/>
+              <w:jc w:val="left"/>
+            </w:pPr>
+            <w:r>
+              <w:rPr>
+                <w:b w:val="0"/>
+                <w:sz w:val="18"/>
+              </w:rPr>
+              <w:t>Offline Flask dashboard (bundled Chart.js and fonts): one drop zone for flow files, PCAPs or a .zip; timeline, forecast fan, stage mix, attributions and flagged hosts update live; per-network alert thresholds (site profiles); one-click incident report; SHA-256-verified model weights.</w:t>
+            </w:r>
+          </w:p>
+        </w:tc>
+      </w:tr>
+    </w:tbl>
     <w:p>
       <w:pPr>
         <w:pStyle w:val="Heading1"/>
@@ -220,23 +598,60 @@
       </w:r>
     </w:p>
     <w:p>
-      <w:r>
-        <w:rPr>
-          <w:b w:val="0"/>
-        </w:rPr>
-        <w:t xml:space="preserve">CTU-13 (flows + full packet captures), CIC-IDS2017 and CSE-CIC-IDS2018 (CICFlowMeter flows), UNSW-NB15 (flow records), LANL cyber1 (router flows + red-team events), DARPA 1999 (tcpdump + attack truth list) and CICIoT2023 (per-activity packet captures). </w:t>
-      </w:r>
+      <w:pPr>
+        <w:pStyle w:val="ListBullet"/>
+        <w:spacing w:after="30"/>
+        <w:ind w:left="283"/>
+      </w:pPr>
       <w:r>
         <w:rPr>
           <w:b/>
         </w:rPr>
-        <w:t>Every test source is unseen in training</w:t>
+        <w:t xml:space="preserve">All seven PS datasets: </w:t>
       </w:r>
       <w:r>
         <w:rPr>
           <w:b w:val="0"/>
         </w:rPr>
-        <w:t>: other botnet families (CTU-13), other days (CIC, UNSW, DARPA), another 12 h slice (LANL), other attack types (CICIoT2023). Validation = every 5th 5-minute block of the training sources. Labels map to ATT&amp;CK stages by behaviour; all seven stages occur. The LR baseline uses the same state features and targets; operating thresholds are chosen per dataset on validation only (most detection with at most 5 % false alarms, same rule for both models).</w:t>
+        <w:t>CTU-13 (flows + full packet captures), CIC-IDS2017 and CSE-CIC-IDS2018 (CICFlowMeter flows), UNSW-NB15 (flow records), LANL cyber1 (router flows + red-team events), DARPA 1999 (tcpdump + attack truth list) and CICIoT2023 (per-activity packet captures).</w:t>
+      </w:r>
+    </w:p>
+    <w:p>
+      <w:pPr>
+        <w:pStyle w:val="ListBullet"/>
+        <w:spacing w:after="30"/>
+        <w:ind w:left="283"/>
+      </w:pPr>
+      <w:r>
+        <w:rPr>
+          <w:b/>
+        </w:rPr>
+        <w:t xml:space="preserve">Test data unseen in training: </w:t>
+      </w:r>
+      <w:r>
+        <w:rPr>
+          <w:b w:val="0"/>
+        </w:rPr>
+        <w:t>other botnet families (CTU-13), other days (CIC, UNSW, DARPA), another 12 h slice (LANL), other attack types (CICIoT2023). Validation = every 5th 5-minute block of the training sources.</w:t>
+      </w:r>
+    </w:p>
+    <w:p>
+      <w:pPr>
+        <w:pStyle w:val="ListBullet"/>
+        <w:spacing w:after="30"/>
+        <w:ind w:left="283"/>
+      </w:pPr>
+      <w:r>
+        <w:rPr>
+          <w:b/>
+        </w:rPr>
+        <w:t xml:space="preserve">Fair baseline: </w:t>
+      </w:r>
+      <w:r>
+        <w:rPr>
+          <w:b w:val="0"/>
+        </w:rPr>
+        <w:t>logistic regression on the same state features and targets. Operating thresholds are chosen per dataset on validation only (most detection with at most 5 % false alarms), with the same rule for both models. Labels map to ATT&amp;CK stages by behaviour; all seven stages occur.</w:t>
       </w:r>
     </w:p>
     <w:p>
@@ -244,15 +659,22 @@
         <w:pStyle w:val="Heading1"/>
       </w:pPr>
       <w:r>
-        <w:t>5. Results on unseen test data (AUROC, world model / LR baseline)</w:t>
+        <w:t>5. Results on unseen test data</w:t>
       </w:r>
     </w:p>
     <w:tbl>
       <w:tblPr>
-        <w:tblStyle w:val="TableGrid"/>
         <w:tblW w:type="auto" w:w="0"/>
         <w:jc w:val="center"/>
         <w:tblLook w:firstColumn="1" w:firstRow="1" w:lastColumn="0" w:lastRow="0" w:noHBand="0" w:noVBand="1" w:val="04A0"/>
+        <w:tblBorders>
+          <w:top w:val="single" w:sz="4" w:space="0" w:color="D5DDEA"/>
+          <w:left w:val="single" w:sz="4" w:space="0" w:color="D5DDEA"/>
+          <w:bottom w:val="single" w:sz="4" w:space="0" w:color="D5DDEA"/>
+          <w:right w:val="single" w:sz="4" w:space="0" w:color="D5DDEA"/>
+          <w:insideH w:val="single" w:sz="4" w:space="0" w:color="D5DDEA"/>
+          <w:insideV w:val="single" w:sz="4" w:space="0" w:color="D5DDEA"/>
+        </w:tblBorders>
       </w:tblPr>
       <w:tblGrid>
         <w:gridCol w:w="2523"/>
@@ -263,18 +685,18 @@
       <w:tr>
         <w:tc>
           <w:tcPr>
-            <w:tcW w:type="dxa" w:w="2948"/>
-            <w:shd w:val="clear" w:color="auto" w:fill="E6F4F1"/>
+            <w:tcW w:type="dxa" w:w="3515"/>
+            <w:shd w:val="clear" w:color="auto" w:fill="1F4E9A"/>
           </w:tcPr>
           <w:p>
             <w:pPr>
               <w:spacing w:after="0"/>
               <w:jc w:val="left"/>
             </w:pPr>
-            <w:r/>
             <w:r>
               <w:rPr>
                 <w:b/>
+                <w:color w:val="FFFFFF"/>
                 <w:sz w:val="17"/>
               </w:rPr>
               <w:t>Dataset (unseen test data)</w:t>
@@ -283,61 +705,61 @@
         </w:tc>
         <w:tc>
           <w:tcPr>
-            <w:tcW w:type="dxa" w:w="2324"/>
-            <w:shd w:val="clear" w:color="auto" w:fill="E6F4F1"/>
+            <w:tcW w:type="dxa" w:w="2154"/>
+            <w:shd w:val="clear" w:color="auto" w:fill="1F4E9A"/>
           </w:tcPr>
           <w:p>
             <w:pPr>
               <w:spacing w:after="0"/>
               <w:jc w:val="center"/>
             </w:pPr>
-            <w:r/>
             <w:r>
               <w:rPr>
                 <w:b/>
+                <w:color w:val="FFFFFF"/>
                 <w:sz w:val="17"/>
               </w:rPr>
-              <w:t>Forecast WM / LR</w:t>
+              <w:t>Forecast</w:t>
             </w:r>
           </w:p>
         </w:tc>
         <w:tc>
           <w:tcPr>
-            <w:tcW w:type="dxa" w:w="2324"/>
-            <w:shd w:val="clear" w:color="auto" w:fill="E6F4F1"/>
+            <w:tcW w:type="dxa" w:w="2154"/>
+            <w:shd w:val="clear" w:color="auto" w:fill="1F4E9A"/>
           </w:tcPr>
           <w:p>
             <w:pPr>
               <w:spacing w:after="0"/>
               <w:jc w:val="center"/>
             </w:pPr>
-            <w:r/>
             <w:r>
               <w:rPr>
                 <w:b/>
+                <w:color w:val="FFFFFF"/>
                 <w:sz w:val="17"/>
               </w:rPr>
-              <w:t>Early warning WM / LR</w:t>
+              <w:t>Early warning</w:t>
             </w:r>
           </w:p>
         </w:tc>
         <w:tc>
           <w:tcPr>
-            <w:tcW w:type="dxa" w:w="2324"/>
-            <w:shd w:val="clear" w:color="auto" w:fill="E6F4F1"/>
+            <w:tcW w:type="dxa" w:w="2154"/>
+            <w:shd w:val="clear" w:color="auto" w:fill="1F4E9A"/>
           </w:tcPr>
           <w:p>
             <w:pPr>
               <w:spacing w:after="0"/>
               <w:jc w:val="center"/>
             </w:pPr>
-            <w:r/>
             <w:r>
               <w:rPr>
                 <w:b/>
+                <w:color w:val="FFFFFF"/>
                 <w:sz w:val="17"/>
               </w:rPr>
-              <w:t>Detection WM / LR</w:t>
+              <w:t>Detection</w:t>
             </w:r>
           </w:p>
         </w:tc>
@@ -345,14 +767,13 @@
       <w:tr>
         <w:tc>
           <w:tcPr>
-            <w:tcW w:type="dxa" w:w="2948"/>
+            <w:tcW w:type="dxa" w:w="3515"/>
           </w:tcPr>
           <w:p>
             <w:pPr>
               <w:spacing w:after="0"/>
               <w:jc w:val="left"/>
             </w:pPr>
-            <w:r/>
             <w:r>
               <w:rPr>
                 <w:b w:val="0"/>
@@ -364,14 +785,13 @@
         </w:tc>
         <w:tc>
           <w:tcPr>
-            <w:tcW w:type="dxa" w:w="2324"/>
+            <w:tcW w:type="dxa" w:w="2154"/>
           </w:tcPr>
           <w:p>
             <w:pPr>
               <w:spacing w:after="0"/>
               <w:jc w:val="center"/>
             </w:pPr>
-            <w:r/>
             <w:r>
               <w:rPr>
                 <w:b w:val="0"/>
@@ -383,14 +803,13 @@
         </w:tc>
         <w:tc>
           <w:tcPr>
-            <w:tcW w:type="dxa" w:w="2324"/>
+            <w:tcW w:type="dxa" w:w="2154"/>
           </w:tcPr>
           <w:p>
             <w:pPr>
               <w:spacing w:after="0"/>
               <w:jc w:val="center"/>
             </w:pPr>
-            <w:r/>
             <w:r>
               <w:rPr>
                 <w:b w:val="0"/>
@@ -402,14 +821,13 @@
         </w:tc>
         <w:tc>
           <w:tcPr>
-            <w:tcW w:type="dxa" w:w="2324"/>
+            <w:tcW w:type="dxa" w:w="2154"/>
           </w:tcPr>
           <w:p>
             <w:pPr>
               <w:spacing w:after="0"/>
               <w:jc w:val="center"/>
             </w:pPr>
-            <w:r/>
             <w:r>
               <w:rPr>
                 <w:b w:val="0"/>
@@ -423,14 +841,13 @@
       <w:tr>
         <w:tc>
           <w:tcPr>
-            <w:tcW w:type="dxa" w:w="2948"/>
+            <w:tcW w:type="dxa" w:w="3515"/>
           </w:tcPr>
           <w:p>
             <w:pPr>
               <w:spacing w:after="0"/>
               <w:jc w:val="left"/>
             </w:pPr>
-            <w:r/>
             <w:r>
               <w:rPr>
                 <w:b w:val="0"/>
@@ -442,14 +859,13 @@
         </w:tc>
         <w:tc>
           <w:tcPr>
-            <w:tcW w:type="dxa" w:w="2324"/>
+            <w:tcW w:type="dxa" w:w="2154"/>
           </w:tcPr>
           <w:p>
             <w:pPr>
               <w:spacing w:after="0"/>
               <w:jc w:val="center"/>
             </w:pPr>
-            <w:r/>
             <w:r>
               <w:rPr>
                 <w:b w:val="0"/>
@@ -461,14 +877,13 @@
         </w:tc>
         <w:tc>
           <w:tcPr>
-            <w:tcW w:type="dxa" w:w="2324"/>
+            <w:tcW w:type="dxa" w:w="2154"/>
           </w:tcPr>
           <w:p>
             <w:pPr>
               <w:spacing w:after="0"/>
               <w:jc w:val="center"/>
             </w:pPr>
-            <w:r/>
             <w:r>
               <w:rPr>
                 <w:b w:val="0"/>
@@ -480,14 +895,13 @@
         </w:tc>
         <w:tc>
           <w:tcPr>
-            <w:tcW w:type="dxa" w:w="2324"/>
+            <w:tcW w:type="dxa" w:w="2154"/>
           </w:tcPr>
           <w:p>
             <w:pPr>
               <w:spacing w:after="0"/>
               <w:jc w:val="center"/>
             </w:pPr>
-            <w:r/>
             <w:r>
               <w:rPr>
                 <w:b w:val="0"/>
@@ -501,14 +915,13 @@
       <w:tr>
         <w:tc>
           <w:tcPr>
-            <w:tcW w:type="dxa" w:w="2948"/>
+            <w:tcW w:type="dxa" w:w="3515"/>
           </w:tcPr>
           <w:p>
             <w:pPr>
               <w:spacing w:after="0"/>
               <w:jc w:val="left"/>
             </w:pPr>
-            <w:r/>
             <w:r>
               <w:rPr>
                 <w:b w:val="0"/>
@@ -520,14 +933,13 @@
         </w:tc>
         <w:tc>
           <w:tcPr>
-            <w:tcW w:type="dxa" w:w="2324"/>
+            <w:tcW w:type="dxa" w:w="2154"/>
           </w:tcPr>
           <w:p>
             <w:pPr>
               <w:spacing w:after="0"/>
               <w:jc w:val="center"/>
             </w:pPr>
-            <w:r/>
             <w:r>
               <w:rPr>
                 <w:b w:val="0"/>
@@ -539,14 +951,13 @@
         </w:tc>
         <w:tc>
           <w:tcPr>
-            <w:tcW w:type="dxa" w:w="2324"/>
+            <w:tcW w:type="dxa" w:w="2154"/>
           </w:tcPr>
           <w:p>
             <w:pPr>
               <w:spacing w:after="0"/>
               <w:jc w:val="center"/>
             </w:pPr>
-            <w:r/>
             <w:r>
               <w:rPr>
                 <w:b w:val="0"/>
@@ -558,14 +969,13 @@
         </w:tc>
         <w:tc>
           <w:tcPr>
-            <w:tcW w:type="dxa" w:w="2324"/>
+            <w:tcW w:type="dxa" w:w="2154"/>
           </w:tcPr>
           <w:p>
             <w:pPr>
               <w:spacing w:after="0"/>
               <w:jc w:val="center"/>
             </w:pPr>
-            <w:r/>
             <w:r>
               <w:rPr>
                 <w:b w:val="0"/>
@@ -579,14 +989,13 @@
       <w:tr>
         <w:tc>
           <w:tcPr>
-            <w:tcW w:type="dxa" w:w="2948"/>
+            <w:tcW w:type="dxa" w:w="3515"/>
           </w:tcPr>
           <w:p>
             <w:pPr>
               <w:spacing w:after="0"/>
               <w:jc w:val="left"/>
             </w:pPr>
-            <w:r/>
             <w:r>
               <w:rPr>
                 <w:b w:val="0"/>
@@ -598,14 +1007,13 @@
         </w:tc>
         <w:tc>
           <w:tcPr>
-            <w:tcW w:type="dxa" w:w="2324"/>
+            <w:tcW w:type="dxa" w:w="2154"/>
           </w:tcPr>
           <w:p>
             <w:pPr>
               <w:spacing w:after="0"/>
               <w:jc w:val="center"/>
             </w:pPr>
-            <w:r/>
             <w:r>
               <w:rPr>
                 <w:b w:val="0"/>
@@ -617,14 +1025,13 @@
         </w:tc>
         <w:tc>
           <w:tcPr>
-            <w:tcW w:type="dxa" w:w="2324"/>
+            <w:tcW w:type="dxa" w:w="2154"/>
           </w:tcPr>
           <w:p>
             <w:pPr>
               <w:spacing w:after="0"/>
               <w:jc w:val="center"/>
             </w:pPr>
-            <w:r/>
             <w:r>
               <w:rPr>
                 <w:b w:val="0"/>
@@ -636,14 +1043,13 @@
         </w:tc>
         <w:tc>
           <w:tcPr>
-            <w:tcW w:type="dxa" w:w="2324"/>
+            <w:tcW w:type="dxa" w:w="2154"/>
           </w:tcPr>
           <w:p>
             <w:pPr>
               <w:spacing w:after="0"/>
               <w:jc w:val="center"/>
             </w:pPr>
-            <w:r/>
             <w:r>
               <w:rPr>
                 <w:b w:val="0"/>
@@ -657,14 +1063,13 @@
       <w:tr>
         <w:tc>
           <w:tcPr>
-            <w:tcW w:type="dxa" w:w="2948"/>
+            <w:tcW w:type="dxa" w:w="3515"/>
           </w:tcPr>
           <w:p>
             <w:pPr>
               <w:spacing w:after="0"/>
               <w:jc w:val="left"/>
             </w:pPr>
-            <w:r/>
             <w:r>
               <w:rPr>
                 <w:b w:val="0"/>
@@ -676,14 +1081,13 @@
         </w:tc>
         <w:tc>
           <w:tcPr>
-            <w:tcW w:type="dxa" w:w="2324"/>
+            <w:tcW w:type="dxa" w:w="2154"/>
           </w:tcPr>
           <w:p>
             <w:pPr>
               <w:spacing w:after="0"/>
               <w:jc w:val="center"/>
             </w:pPr>
-            <w:r/>
             <w:r>
               <w:rPr>
                 <w:b w:val="0"/>
@@ -695,14 +1099,13 @@
         </w:tc>
         <w:tc>
           <w:tcPr>
-            <w:tcW w:type="dxa" w:w="2324"/>
+            <w:tcW w:type="dxa" w:w="2154"/>
           </w:tcPr>
           <w:p>
             <w:pPr>
               <w:spacing w:after="0"/>
               <w:jc w:val="center"/>
             </w:pPr>
-            <w:r/>
             <w:r>
               <w:rPr>
                 <w:b w:val="0"/>
@@ -714,14 +1117,13 @@
         </w:tc>
         <w:tc>
           <w:tcPr>
-            <w:tcW w:type="dxa" w:w="2324"/>
+            <w:tcW w:type="dxa" w:w="2154"/>
           </w:tcPr>
           <w:p>
             <w:pPr>
               <w:spacing w:after="0"/>
               <w:jc w:val="center"/>
             </w:pPr>
-            <w:r/>
             <w:r>
               <w:rPr>
                 <w:b w:val="0"/>
@@ -735,14 +1137,13 @@
       <w:tr>
         <w:tc>
           <w:tcPr>
-            <w:tcW w:type="dxa" w:w="2948"/>
+            <w:tcW w:type="dxa" w:w="3515"/>
           </w:tcPr>
           <w:p>
             <w:pPr>
               <w:spacing w:after="0"/>
               <w:jc w:val="left"/>
             </w:pPr>
-            <w:r/>
             <w:r>
               <w:rPr>
                 <w:b w:val="0"/>
@@ -754,14 +1155,13 @@
         </w:tc>
         <w:tc>
           <w:tcPr>
-            <w:tcW w:type="dxa" w:w="2324"/>
+            <w:tcW w:type="dxa" w:w="2154"/>
           </w:tcPr>
           <w:p>
             <w:pPr>
               <w:spacing w:after="0"/>
               <w:jc w:val="center"/>
             </w:pPr>
-            <w:r/>
             <w:r>
               <w:rPr>
                 <w:b w:val="0"/>
@@ -773,14 +1173,13 @@
         </w:tc>
         <w:tc>
           <w:tcPr>
-            <w:tcW w:type="dxa" w:w="2324"/>
+            <w:tcW w:type="dxa" w:w="2154"/>
           </w:tcPr>
           <w:p>
             <w:pPr>
               <w:spacing w:after="0"/>
               <w:jc w:val="center"/>
             </w:pPr>
-            <w:r/>
             <w:r>
               <w:rPr>
                 <w:b w:val="0"/>
@@ -792,14 +1191,13 @@
         </w:tc>
         <w:tc>
           <w:tcPr>
-            <w:tcW w:type="dxa" w:w="2324"/>
+            <w:tcW w:type="dxa" w:w="2154"/>
           </w:tcPr>
           <w:p>
             <w:pPr>
               <w:spacing w:after="0"/>
               <w:jc w:val="center"/>
             </w:pPr>
-            <w:r/>
             <w:r>
               <w:rPr>
                 <w:b w:val="0"/>
@@ -813,14 +1211,13 @@
       <w:tr>
         <w:tc>
           <w:tcPr>
-            <w:tcW w:type="dxa" w:w="2948"/>
+            <w:tcW w:type="dxa" w:w="3515"/>
           </w:tcPr>
           <w:p>
             <w:pPr>
               <w:spacing w:after="0"/>
               <w:jc w:val="left"/>
             </w:pPr>
-            <w:r/>
             <w:r>
               <w:rPr>
                 <w:b w:val="0"/>
@@ -832,14 +1229,13 @@
         </w:tc>
         <w:tc>
           <w:tcPr>
-            <w:tcW w:type="dxa" w:w="2324"/>
+            <w:tcW w:type="dxa" w:w="2154"/>
           </w:tcPr>
           <w:p>
             <w:pPr>
               <w:spacing w:after="0"/>
               <w:jc w:val="center"/>
             </w:pPr>
-            <w:r/>
             <w:r>
               <w:rPr>
                 <w:b w:val="0"/>
@@ -851,14 +1247,13 @@
         </w:tc>
         <w:tc>
           <w:tcPr>
-            <w:tcW w:type="dxa" w:w="2324"/>
+            <w:tcW w:type="dxa" w:w="2154"/>
           </w:tcPr>
           <w:p>
             <w:pPr>
               <w:spacing w:after="0"/>
               <w:jc w:val="center"/>
             </w:pPr>
-            <w:r/>
             <w:r>
               <w:rPr>
                 <w:b w:val="0"/>
@@ -870,14 +1265,13 @@
         </w:tc>
         <w:tc>
           <w:tcPr>
-            <w:tcW w:type="dxa" w:w="2324"/>
+            <w:tcW w:type="dxa" w:w="2154"/>
           </w:tcPr>
           <w:p>
             <w:pPr>
               <w:spacing w:after="0"/>
               <w:jc w:val="center"/>
             </w:pPr>
-            <w:r/>
             <w:r>
               <w:rPr>
                 <w:b w:val="0"/>
@@ -891,33 +1285,33 @@
       <w:tr>
         <w:tc>
           <w:tcPr>
-            <w:tcW w:type="dxa" w:w="2948"/>
+            <w:tcW w:type="dxa" w:w="3515"/>
+            <w:shd w:val="clear" w:color="auto" w:fill="EEF3FA"/>
           </w:tcPr>
           <w:p>
             <w:pPr>
               <w:spacing w:after="0"/>
               <w:jc w:val="left"/>
             </w:pPr>
-            <w:r/>
             <w:r>
               <w:rPr>
                 <w:b/>
                 <w:sz w:val="17"/>
               </w:rPr>
-              <w:t>Macro average (temporal)</w:t>
+              <w:t>Macro average (six temporal datasets)</w:t>
             </w:r>
           </w:p>
         </w:tc>
         <w:tc>
           <w:tcPr>
-            <w:tcW w:type="dxa" w:w="2324"/>
+            <w:tcW w:type="dxa" w:w="2154"/>
+            <w:shd w:val="clear" w:color="auto" w:fill="EEF3FA"/>
           </w:tcPr>
           <w:p>
             <w:pPr>
               <w:spacing w:after="0"/>
               <w:jc w:val="center"/>
             </w:pPr>
-            <w:r/>
             <w:r>
               <w:rPr>
                 <w:b/>
@@ -929,14 +1323,14 @@
         </w:tc>
         <w:tc>
           <w:tcPr>
-            <w:tcW w:type="dxa" w:w="2324"/>
+            <w:tcW w:type="dxa" w:w="2154"/>
+            <w:shd w:val="clear" w:color="auto" w:fill="EEF3FA"/>
           </w:tcPr>
           <w:p>
             <w:pPr>
               <w:spacing w:after="0"/>
               <w:jc w:val="center"/>
             </w:pPr>
-            <w:r/>
             <w:r>
               <w:rPr>
                 <w:b/>
@@ -948,14 +1342,14 @@
         </w:tc>
         <w:tc>
           <w:tcPr>
-            <w:tcW w:type="dxa" w:w="2324"/>
+            <w:tcW w:type="dxa" w:w="2154"/>
+            <w:shd w:val="clear" w:color="auto" w:fill="EEF3FA"/>
           </w:tcPr>
           <w:p>
             <w:pPr>
               <w:spacing w:after="0"/>
               <w:jc w:val="center"/>
             </w:pPr>
-            <w:r/>
             <w:r>
               <w:rPr>
                 <w:b/>
@@ -969,18 +1363,40 @@
     </w:tbl>
     <w:p>
       <w:pPr>
-        <w:spacing w:after="20"/>
+        <w:spacing w:after="60" w:before="40"/>
       </w:pPr>
       <w:r>
         <w:rPr>
           <w:b w:val="0"/>
+          <w:color w:val="52606D"/>
+          <w:sz w:val="16"/>
         </w:rPr>
+        <w:t>AUROC, world model / logistic-regression baseline. Early warning = forecasting from windows that are still benign. CICIoT2023 episodes are composed (benign capture, then attack capture), so only detection is scored.</w:t>
       </w:r>
     </w:p>
     <w:p>
       <w:pPr>
         <w:pStyle w:val="ListBullet"/>
-        <w:spacing w:after="20"/>
+        <w:spacing w:after="30"/>
+        <w:ind w:left="283"/>
+      </w:pPr>
+      <w:r>
+        <w:rPr>
+          <w:b/>
+        </w:rPr>
+        <w:t xml:space="preserve">Early warning: </w:t>
+      </w:r>
+      <w:r>
+        <w:rPr>
+          <w:b w:val="0"/>
+        </w:rPr>
+        <w:t>54 of 201 attack onsets were forecast before they began, against 17 for the baseline; when the model warns, it does so 51–60 s ahead on average.</w:t>
+      </w:r>
+    </w:p>
+    <w:p>
+      <w:pPr>
+        <w:pStyle w:val="ListBullet"/>
+        <w:spacing w:after="30"/>
         <w:ind w:left="283"/>
       </w:pPr>
       <w:r>
@@ -993,32 +1409,32 @@
         <w:rPr>
           <w:b w:val="0"/>
         </w:rPr>
-        <w:t>world model ahead on 2 of 6 temporal datasets (macro AUROC 0.70 vs 0.67; LR ahead on UNSW-NB15, LANL cyber1, DARPA 1999); 54 of 201 attack onsets forecast before they began, vs 17 for LR. On validation the world model leads on every dataset; unseen days generalise less well.</w:t>
+        <w:t>ahead on CTU-13 and CSE-CIC-IDS2018, tied on CIC-IDS2017; the baseline is ahead on UNSW-NB15, LANL cyber1, DARPA 1999. On validation the world model leads on every dataset, so generalising to unseen days is the main open problem.</w:t>
       </w:r>
     </w:p>
     <w:p>
       <w:pPr>
         <w:pStyle w:val="ListBullet"/>
-        <w:spacing w:after="20"/>
+        <w:spacing w:after="30"/>
         <w:ind w:left="283"/>
       </w:pPr>
       <w:r>
         <w:rPr>
           <w:b/>
         </w:rPr>
-        <w:t xml:space="preserve">Stated plainly: </w:t>
+        <w:t xml:space="preserve">Detection: </w:t>
       </w:r>
       <w:r>
         <w:rPr>
           <w:b w:val="0"/>
         </w:rPr>
-        <w:t>detection of the current window: LR is better on LANL cyber1, DARPA 1999. CICIoT2023 episodes are composed (benign capture then attack capture) and scored for detection only. Thresholds must be calibrated per site; PCAP-only input relies on flows rebuilt from packets.</w:t>
+        <w:t>ahead on 4 of 7 datasets; the baseline is better on LANL cyber1 and DARPA 1999.</w:t>
       </w:r>
     </w:p>
     <w:p>
       <w:pPr>
         <w:pStyle w:val="ListBullet"/>
-        <w:spacing w:after="20"/>
+        <w:spacing w:after="30"/>
         <w:ind w:left="283"/>
       </w:pPr>
       <w:r>
@@ -1031,18 +1447,27 @@
         <w:rPr>
           <w:b w:val="0"/>
         </w:rPr>
-        <w:t>0.04 ms per 10 s window batched on GPU, ~8 ms streamed on a laptop CPU (32 rollouts); ~125k packets/s ingestion. Reproduce: fetch_datasets.sh → prepare_data.py / prepare_all.py → train.py → evaluate.py (seeded config).</w:t>
+        <w:t>~8 ms per 10 s window streamed on a laptop CPU (32 rollouts), 0.04 ms batched on a GPU; ~125k packets/s ingestion.</w:t>
       </w:r>
     </w:p>
     <w:p>
       <w:pPr>
+        <w:pStyle w:val="Heading1"/>
+      </w:pPr>
+      <w:r>
+        <w:t>6. Working prototype</w:t>
+      </w:r>
+    </w:p>
+    <w:p>
+      <w:pPr>
+        <w:spacing w:after="20"/>
         <w:jc w:val="center"/>
       </w:pPr>
       <w:r>
         <w:drawing>
           <wp:inline xmlns:a="http://schemas.openxmlformats.org/drawingml/2006/main" xmlns:pic="http://schemas.openxmlformats.org/drawingml/2006/picture">
-            <wp:extent cx="5940000" cy="2808000"/>
-            <wp:docPr id="2" name="Picture 2"/>
+            <wp:extent cx="6048000" cy="3259200"/>
+            <wp:docPr id="3" name="Picture 3"/>
             <wp:cNvGraphicFramePr>
               <a:graphicFrameLocks noChangeAspect="1"/>
             </wp:cNvGraphicFramePr>
@@ -1050,11 +1475,11 @@
               <a:graphicData uri="http://schemas.openxmlformats.org/drawingml/2006/picture">
                 <pic:pic>
                   <pic:nvPicPr>
-                    <pic:cNvPr id="0" name="timeline_s47.png"/>
+                    <pic:cNvPr id="0" name="dashboard_light.png"/>
                     <pic:cNvPicPr/>
                   </pic:nvPicPr>
                   <pic:blipFill>
-                    <a:blip r:embed="rId10"/>
+                    <a:blip r:embed="rId12"/>
                     <a:stretch>
                       <a:fillRect/>
                     </a:stretch>
@@ -1062,7 +1487,7 @@
                   <pic:spPr>
                     <a:xfrm>
                       <a:off x="0" y="0"/>
-                      <a:ext cx="5940000" cy="2808000"/>
+                      <a:ext cx="6048000" cy="3259200"/>
                     </a:xfrm>
                     <a:prstGeom prst="rect"/>
                   </pic:spPr>
@@ -1080,20 +1505,176 @@
       <w:r>
         <w:rPr>
           <w:b w:val="0"/>
-          <w:i/>
+          <w:color w:val="52606D"/>
           <w:sz w:val="16"/>
         </w:rPr>
-        <w:t>Figure: unseen CTU-13 Menti capture. Shaded = ground-truth malicious windows; dark = world-model P(attack within 60 s) with 10–90 % band; grey = LR baseline on the same features.</w:t>
+        <w:t>Offline dashboard on an unseen CIC-IDS2017 day: risk stays low for six minutes, then goes critical as the DDoS starts; the baseline (dashed) raises false spikes.</w:t>
       </w:r>
     </w:p>
+    <w:p>
+      <w:pPr>
+        <w:pStyle w:val="Heading1"/>
+      </w:pPr>
+      <w:r>
+        <w:t>7. Deployment, limits and next steps</w:t>
+      </w:r>
+    </w:p>
+    <w:p>
+      <w:pPr>
+        <w:pStyle w:val="ListBullet"/>
+        <w:spacing w:after="30"/>
+        <w:ind w:left="283"/>
+      </w:pPr>
+      <w:r>
+        <w:rPr>
+          <w:b/>
+        </w:rPr>
+        <w:t xml:space="preserve">Deployment: </w:t>
+      </w:r>
+      <w:r>
+        <w:rPr>
+          <w:b w:val="0"/>
+        </w:rPr>
+        <w:t>air-gapped and CPU-only; streams captures in bounded memory. Reproducible from one seeded configuration: fetch_datasets.sh → prepare_data.py / prepare_all.py → train.py → evaluate.py.</w:t>
+      </w:r>
+    </w:p>
+    <w:p>
+      <w:pPr>
+        <w:pStyle w:val="ListBullet"/>
+        <w:spacing w:after="30"/>
+        <w:ind w:left="283"/>
+      </w:pPr>
+      <w:r>
+        <w:rPr>
+          <w:b/>
+        </w:rPr>
+        <w:t xml:space="preserve">Limits: </w:t>
+      </w:r>
+      <w:r>
+        <w:rPr>
+          <w:b w:val="0"/>
+        </w:rPr>
+        <w:t>weak on LANL-type authentication attacks and behind the baseline on DARPA 1999; alert thresholds need per-site calibration; PCAP-only input relies on flows rebuilt from packets.</w:t>
+      </w:r>
+    </w:p>
+    <w:p>
+      <w:pPr>
+        <w:pStyle w:val="ListBullet"/>
+        <w:spacing w:after="30"/>
+        <w:ind w:left="283"/>
+      </w:pPr>
+      <w:r>
+        <w:rPr>
+          <w:b/>
+        </w:rPr>
+        <w:t xml:space="preserve">Next: </w:t>
+      </w:r>
+      <w:r>
+        <w:rPr>
+          <w:b w:val="0"/>
+        </w:rPr>
+        <w:t>host-graph (GNN) state, online threshold calibration, a streaming NetFlow / IPFIX collector and SOC integration (syslog, STIX).</w:t>
+      </w:r>
+    </w:p>
+    <w:p>
+      <w:pPr>
+        <w:spacing w:after="0" w:before="80"/>
+      </w:pPr>
+      <w:r>
+        <w:rPr>
+          <w:b/>
+        </w:rPr>
+        <w:t xml:space="preserve">Code, weights and benchmark: </w:t>
+      </w:r>
+      <w:hyperlink r:id="rId13">
+        <w:r>
+          <w:rPr>
+            <w:color w:val="1F4E9A"/>
+            <w:u w:val="single"/>
+            <w:sz w:val="19"/>
+          </w:rPr>
+          <w:t xml:space="preserve">https://github.com/NAMAN-THAKUR-1944/SIH2026-SIH26153-VIGHNAX</w:t>
+        </w:r>
+      </w:hyperlink>
+      <w:r>
+        <w:rPr>
+          <w:b w:val="0"/>
+        </w:rPr>
+        <w:t xml:space="preserve">   ·   </w:t>
+      </w:r>
+      <w:r>
+        <w:rPr>
+          <w:b/>
+        </w:rPr>
+        <w:t xml:space="preserve">Demo video: </w:t>
+      </w:r>
+      <w:hyperlink r:id="rId14">
+        <w:r>
+          <w:rPr>
+            <w:color w:val="1F4E9A"/>
+            <w:u w:val="single"/>
+            <w:sz w:val="19"/>
+          </w:rPr>
+          <w:t xml:space="preserve">https://youtu.be/pPTe-d_TByU</w:t>
+        </w:r>
+      </w:hyperlink>
+    </w:p>
     <w:sectPr>
+      <w:footerReference w:type="default" r:id="rId9"/>
       <w:pgSz w:w="11906" w:h="16838"/>
-      <w:pgMar w:top="737" w:right="907" w:bottom="680" w:left="907" w:header="720" w:footer="720" w:gutter="0"/>
+      <w:pgMar w:top="624" w:right="907" w:bottom="737" w:left="907" w:header="720" w:footer="340" w:gutter="0"/>
       <w:cols w:space="720"/>
       <w:docGrid w:linePitch="360"/>
     </w:sectPr>
   </w:body>
 </w:document>
+</file>
+
+<file path=word/footer1.xml><?xml version="1.0" encoding="utf-8"?>
+<w:ftr xmlns:m="http://schemas.openxmlformats.org/officeDocument/2006/math" xmlns:mc="http://schemas.openxmlformats.org/markup-compatibility/2006" xmlns:mo="http://schemas.microsoft.com/office/mac/office/2008/main" xmlns:mv="urn:schemas-microsoft-com:mac:vml" xmlns:o="urn:schemas-microsoft-com:office:office" xmlns:r="http://schemas.openxmlformats.org/officeDocument/2006/relationships" xmlns:v="urn:schemas-microsoft-com:vml" xmlns:w10="urn:schemas-microsoft-com:office:word" xmlns:w14="http://schemas.microsoft.com/office/word/2010/wordml" xmlns:w="http://schemas.openxmlformats.org/wordprocessingml/2006/main" xmlns:wne="http://schemas.microsoft.com/office/word/2006/wordml" xmlns:wp14="http://schemas.microsoft.com/office/word/2010/wordprocessingDrawing" xmlns:wp="http://schemas.openxmlformats.org/drawingml/2006/wordprocessingDrawing" xmlns:wpc="http://schemas.microsoft.com/office/word/2010/wordprocessingCanvas" xmlns:wpg="http://schemas.microsoft.com/office/word/2010/wordprocessingGroup" xmlns:wpi="http://schemas.microsoft.com/office/word/2010/wordprocessingInk" xmlns:wps="http://schemas.microsoft.com/office/word/2010/wordprocessingShape" mc:Ignorable="w14 wp14">
+  <w:p>
+    <w:pPr>
+      <w:pStyle w:val="Footer"/>
+      <w:jc w:val="center"/>
+    </w:pPr>
+    <w:r>
+      <w:rPr>
+        <w:color w:val="52606D"/>
+        <w:sz w:val="16"/>
+      </w:rPr>
+      <w:t xml:space="preserve">Team VIGHNAX (Team ID 127364) · SIH 2026 · PS SIH26153 · Architecture document · page </w:t>
+    </w:r>
+    <w:r>
+      <w:rPr>
+        <w:color w:val="52606D"/>
+        <w:sz w:val="16"/>
+      </w:rPr>
+      <w:fldChar w:fldCharType="begin"/>
+      <w:instrText xml:space="preserve"> PAGE </w:instrText>
+      <w:fldChar w:fldCharType="separate"/>
+      <w:t>1</w:t>
+      <w:fldChar w:fldCharType="end"/>
+    </w:r>
+    <w:r>
+      <w:rPr>
+        <w:color w:val="52606D"/>
+        <w:sz w:val="16"/>
+      </w:rPr>
+      <w:t xml:space="preserve"> of </w:t>
+    </w:r>
+    <w:r>
+      <w:rPr>
+        <w:color w:val="52606D"/>
+        <w:sz w:val="16"/>
+      </w:rPr>
+      <w:fldChar w:fldCharType="begin"/>
+      <w:instrText xml:space="preserve"> NUMPAGES </w:instrText>
+      <w:fldChar w:fldCharType="separate"/>
+      <w:t>1</w:t>
+      <w:fldChar w:fldCharType="end"/>
+    </w:r>
+  </w:p>
+</w:ftr>
 </file>
 
 <file path=word/numbering.xml><?xml version="1.0" encoding="utf-8"?>
@@ -1464,6 +2045,7 @@
     </w:pPr>
     <w:rPr>
       <w:rFonts w:ascii="Calibri" w:hAnsi="Calibri"/>
+      <w:color w:val="1F2933"/>
       <w:sz w:val="19"/>
     </w:rPr>
   </w:style>
@@ -1522,14 +2104,14 @@
     <w:pPr>
       <w:keepNext/>
       <w:keepLines/>
-      <w:spacing w:before="100" w:after="40"/>
+      <w:spacing w:before="140" w:after="60"/>
       <w:outlineLvl w:val="0"/>
     </w:pPr>
     <w:rPr>
       <w:rFonts w:asciiTheme="majorHAnsi" w:eastAsiaTheme="majorEastAsia" w:hAnsiTheme="majorHAnsi" w:cstheme="majorBidi" w:ascii="Calibri" w:hAnsi="Calibri"/>
       <w:b/>
       <w:bCs/>
-      <w:color w:val="0F766E"/>
+      <w:color w:val="1F4E9A"/>
       <w:sz w:val="23"/>
       <w:szCs w:val="28"/>
     </w:rPr>
@@ -1546,15 +2128,15 @@
     <w:pPr>
       <w:keepNext/>
       <w:keepLines/>
-      <w:spacing w:before="100" w:after="40"/>
+      <w:spacing w:before="200" w:after="0"/>
       <w:outlineLvl w:val="1"/>
     </w:pPr>
     <w:rPr>
-      <w:rFonts w:asciiTheme="majorHAnsi" w:eastAsiaTheme="majorEastAsia" w:hAnsiTheme="majorHAnsi" w:cstheme="majorBidi" w:ascii="Calibri" w:hAnsi="Calibri"/>
+      <w:rFonts w:asciiTheme="majorHAnsi" w:eastAsiaTheme="majorEastAsia" w:hAnsiTheme="majorHAnsi" w:cstheme="majorBidi"/>
       <w:b/>
       <w:bCs/>
-      <w:color w:val="0F766E"/>
-      <w:sz w:val="20"/>
+      <w:color w:val="4F81BD" w:themeColor="accent1"/>
+      <w:sz w:val="26"/>
       <w:szCs w:val="26"/>
     </w:rPr>
   </w:style>

</xml_diff>